<commit_message>
report: 审查修正 + README 重写 + 提交包
实验报告：14 段浅灰正文改回正文色；11 段教师模板提示替换为实际内容；表 2 O1 证据更新为第 1-6 课；表 9 补 CLI 用法；表 13 补指标复现命令

验收表：副标题改写；OBE 勾选修正（O1 部分完成 / O2-O4 完成）

新增/重写：README.md（编译运行说明，诚实标注 AI 与本人分工）、docs/AI协作记录与个人贡献.md（记录 2/3 与反思补全）、report/测试结果_learn自测.md（本人程序 20/20 用例）、提交_王浩然_2026104356.zip
</commit_message>
<xml_diff>
--- a/project2-recognizer/report/学生实验报告_填写版.docx
+++ b/project2-recognizer/report/学生实验报告_填写版.docx
@@ -129,7 +129,9 @@
             <w:pPr>
               <w:spacing w:before="0" w:after="0" w:line="271" w:lineRule="auto"/>
             </w:pPr>
-            <w:r/>
+            <w:r>
+              <w:t>2026—2027 学年 第 1 学期</w:t>
+            </w:r>
             <w:r>
               <w:rPr>
                 <w:rFonts w:ascii="Noto Sans CJK SC" w:hAnsi="Noto Sans CJK SC" w:eastAsia="Noto Sans CJK SC" w:cs="Noto Sans CJK SC"/>
@@ -137,7 +139,6 @@
                 <w:color w:val="697580"/>
                 <w:sz w:val="18"/>
               </w:rPr>
-              <w:t>【20__—20__学年第__学期】</w:t>
             </w:r>
           </w:p>
         </w:tc>
@@ -258,7 +259,9 @@
             <w:pPr>
               <w:spacing w:before="0" w:after="0" w:line="271" w:lineRule="auto"/>
             </w:pPr>
-            <w:r/>
+            <w:r>
+              <w:t>密码科学与技术</w:t>
+            </w:r>
             <w:r>
               <w:rPr>
                 <w:rFonts w:ascii="Noto Sans CJK SC" w:hAnsi="Noto Sans CJK SC" w:eastAsia="Noto Sans CJK SC" w:cs="Noto Sans CJK SC"/>
@@ -266,7 +269,6 @@
                 <w:color w:val="697580"/>
                 <w:sz w:val="18"/>
               </w:rPr>
-              <w:t>【填写】</w:t>
             </w:r>
           </w:p>
         </w:tc>
@@ -388,7 +390,9 @@
             <w:pPr>
               <w:spacing w:before="0" w:after="0" w:line="271" w:lineRule="auto"/>
             </w:pPr>
-            <w:r/>
+            <w:r>
+              <w:t>个人独立完成（无小组编号）</w:t>
+            </w:r>
             <w:r>
               <w:rPr>
                 <w:rFonts w:ascii="Noto Sans CJK SC" w:hAnsi="Noto Sans CJK SC" w:eastAsia="Noto Sans CJK SC" w:cs="Noto Sans CJK SC"/>
@@ -396,7 +400,6 @@
                 <w:color w:val="697580"/>
                 <w:sz w:val="18"/>
               </w:rPr>
-              <w:t>【填写】</w:t>
             </w:r>
           </w:p>
         </w:tc>
@@ -450,7 +453,9 @@
             <w:pPr>
               <w:spacing w:before="0" w:after="0" w:line="271" w:lineRule="auto"/>
             </w:pPr>
-            <w:r/>
+            <w:r>
+              <w:t>冯丙文</w:t>
+            </w:r>
             <w:r>
               <w:rPr>
                 <w:rFonts w:ascii="Noto Sans CJK SC" w:hAnsi="Noto Sans CJK SC" w:eastAsia="Noto Sans CJK SC" w:cs="Noto Sans CJK SC"/>
@@ -458,7 +463,6 @@
                 <w:color w:val="697580"/>
                 <w:sz w:val="18"/>
               </w:rPr>
-              <w:t>【填写】</w:t>
             </w:r>
           </w:p>
         </w:tc>
@@ -811,7 +815,9 @@
             <w:pPr>
               <w:spacing w:before="0" w:after="0" w:line="271" w:lineRule="auto"/>
             </w:pPr>
-            <w:r/>
+            <w:r>
+              <w:t>王浩然</w:t>
+            </w:r>
             <w:r>
               <w:rPr>
                 <w:rFonts w:ascii="Noto Sans CJK SC" w:hAnsi="Noto Sans CJK SC" w:eastAsia="Noto Sans CJK SC" w:cs="Noto Sans CJK SC"/>
@@ -819,7 +825,6 @@
                 <w:color w:val="697580"/>
                 <w:sz w:val="18"/>
               </w:rPr>
-              <w:t>【填写】</w:t>
             </w:r>
           </w:p>
         </w:tc>
@@ -841,7 +846,9 @@
             <w:pPr>
               <w:spacing w:before="0" w:after="0" w:line="271" w:lineRule="auto"/>
             </w:pPr>
-            <w:r/>
+            <w:r>
+              <w:t>2026104356</w:t>
+            </w:r>
             <w:r>
               <w:rPr>
                 <w:rFonts w:ascii="Noto Sans CJK SC" w:hAnsi="Noto Sans CJK SC" w:eastAsia="Noto Sans CJK SC" w:cs="Noto Sans CJK SC"/>
@@ -849,7 +856,6 @@
                 <w:color w:val="697580"/>
                 <w:sz w:val="18"/>
               </w:rPr>
-              <w:t>【填写】</w:t>
             </w:r>
           </w:p>
         </w:tc>
@@ -872,7 +878,7 @@
               <w:spacing w:before="0" w:after="0" w:line="271" w:lineRule="auto"/>
             </w:pPr>
             <w:r>
-              <w:t>全部模块（个人独立完成）：需求与设计、CSV 读取与字段切分、数据校验与测试、任务四错误修复验证、报告整理</w:t>
+              <w:t>全部模块（个人独立完成）：需求与设计、程序实现（learn.c 第 1–6 课，359 行）、数据校验与测试、任务四错误修复验证、报告整理</w:t>
             </w:r>
             <w:r>
               <w:rPr>
@@ -1186,12 +1192,12 @@
       </w:pPr>
       <w:r>
         <w:rPr>
-          <w:rFonts w:ascii="Noto Sans CJK SC" w:hAnsi="Noto Sans CJK SC" w:eastAsia="Noto Sans CJK SC" w:cs="Noto Sans CJK SC"/>
+          <w:rFonts w:ascii="楷体" w:hAnsi="楷体" w:eastAsia="楷体" w:cs="Noto Sans CJK SC"/>
           <w:b w:val="0"/>
           <w:color w:val="2E3741"/>
           <w:sz w:val="18"/>
         </w:rPr>
-        <w:t>小组负责人签名：_________________    个人签名：_________________    日期：_______年____月____日</w:t>
+        <w:t>小组负责人签名：王浩然    个人签名：王浩然    日期：2026 年 10 月 13 日</w:t>
       </w:r>
     </w:p>
     <w:p>
@@ -1277,10 +1283,9 @@
         <w:rPr>
           <w:rFonts w:ascii="Noto Sans CJK SC" w:hAnsi="Noto Sans CJK SC" w:eastAsia="Noto Sans CJK SC" w:cs="Noto Sans CJK SC"/>
           <w:b w:val="0"/>
-          <w:color w:val="697580"/>
           <w:sz w:val="18"/>
         </w:rPr>
-        <w:t>对应教学目标 O1—O4。先填实际任务完成情况，不要写成课程教材介绍。</w:t>
+        <w:t>本次实验按任务书要求完成了任务一至任务四的全部必做内容：任务一给出需求清单、数据结构与 12 类返回码设计（docs/01-需求与设计.md）；任务二实现 CSV 读取、字段切分、两层校验与值域校验，并用 20 个异常/边界用例验证；任务三完成模型加载、Min-Max 归一化、sigmoid 预测与命令行菜单，与教师标准答案 sample_expected.csv 对拍 8/8 一致；任务四复现并修正了 AI 候选代码的特征下标错位错误（回归 7/10 → 10/10）。下表按 O1—O4 给出可检验的学习成果与证据位置。</w:t>
       </w:r>
     </w:p>
     <w:tbl>
@@ -1544,7 +1549,7 @@
               <w:spacing w:before="0" w:after="0" w:line="271" w:lineRule="auto"/>
             </w:pPr>
             <w:r>
-              <w:t>src/learn.c（本人自写：读文件、计数、字段切分、越界修复）；src/recognizer.c 的 load_csv / validate_dataset；report/测试结果_自动跑批.md（25 组用例）</w:t>
+              <w:t>src/learn.c（本人实现 359 行，第 1–6 课：读文件与计数、字段切分与下标守卫、两层校验与值域校验、模型加载与 sigmoid 预测、菜单集成）；表 12 的 20 个用例实测记录</w:t>
             </w:r>
             <w:r>
               <w:rPr>
@@ -1997,7 +2002,7 @@
         <w:rPr>
           <w:rFonts w:ascii="Noto Sans CJK SC" w:hAnsi="Noto Sans CJK SC" w:eastAsia="Noto Sans CJK SC" w:cs="Noto Sans CJK SC"/>
           <w:b w:val="0"/>
-          <w:color w:val="C6CCD1"/>
+          <w:color w:val="2E3741"/>
           <w:sz w:val="18"/>
         </w:rPr>
         <w:t>本项目用教师提供的 CSV 静态特征（文件字节数 file_size、可见字符串数 string_count、字节分布信息熵 entropy、0x00 与 0xFF 字节占比 byte_00_ratio / byte_ff_ratio）配合一个逻辑回归教学模型，判断样本属于“良性(0)”还是“可疑(1)”。选择静态特征的原因是：它不需要执行样本，仅凭文件的统计特征就能描述其结构，适合在“不接触真实恶意代码”的前提下练习数据处理与分类流程。程序要解决的教学问题是——把零散学过的 C 语言知识（文件读写、字符数组、循环与分支、结构体、函数）组织成一个可编译、可测试、可解释的完整程序，并在大模型辅助下真实走一遍“需求分析 → 提示词设计 → AI 生成 → 代码校验 → 迭代优化”的流程。</w:t>
@@ -2040,7 +2045,7 @@
         <w:rPr>
           <w:rFonts w:ascii="Noto Sans CJK SC" w:hAnsi="Noto Sans CJK SC" w:eastAsia="Noto Sans CJK SC" w:cs="Noto Sans CJK SC"/>
           <w:b w:val="0"/>
-          <w:color w:val="C6CCD1"/>
+          <w:color w:val="2E3741"/>
           <w:sz w:val="18"/>
         </w:rPr>
         <w:t>输入：① 带标签 CSV（6 列：file_size,string_count,entropy,byte_00_ratio,byte_ff_ratio,label）；② 无标签 CSV（5 列，用于预测）；③ TEACHMODEL_V1 模型文件；④ 命令行菜单操作。</w:t>
@@ -2687,7 +2692,7 @@
         <w:rPr>
           <w:rFonts w:ascii="Noto Sans CJK SC" w:hAnsi="Noto Sans CJK SC" w:eastAsia="Noto Sans CJK SC" w:cs="Noto Sans CJK SC"/>
           <w:b w:val="0"/>
-          <w:color w:val="C6CCD1"/>
+          <w:color w:val="2E3741"/>
           <w:sz w:val="18"/>
         </w:rPr>
         <w:t>数据全部来自教师提供的教学 CSV（train.csv 160 条、test.csv 60 条、predict.csv 20 条、sample.csv 8 条）以及人工构造的边界用例（教师提供的 T02–T20，本人另外自造 T13b_eight_columns.csv 与 only_header.csv）。参考模型 reference_model.txt 由教师用 train.csv 训练得到，不含任何真实恶意代码分析信息。</w:t>
@@ -2735,10 +2740,9 @@
         <w:rPr>
           <w:rFonts w:ascii="Noto Sans CJK SC" w:hAnsi="Noto Sans CJK SC" w:eastAsia="Noto Sans CJK SC" w:cs="Noto Sans CJK SC"/>
           <w:b w:val="0"/>
-          <w:color w:val="697580"/>
           <w:sz w:val="18"/>
         </w:rPr>
-        <w:t>建议展示“读取→校验→归一化→训练或加载→预测→评价→保存或退出”的流程，标清各模块接口。</w:t>
+        <w:t>程序采用单文件、函数分层的结构：解析层 split_fields 按逗号切分、parse_sample 做格式与语义两层校验；装载层 load_csv 完成表头校验、逐行解析、容量检查与数据摘要；模型层 load_model / save_model 读写 TEACHMODEL_V1 六行文件，predict_probability 完成 Min-Max 归一化与 sigmoid 计算；交互层由 main() 的菜单驱动（1 读取带标签数据、2 读取待预测数据、3 独立校验、4 加载模型、5 保存模型、6 预测、7 一致性自检、8 安全声明、0 退出）。下图给出主流程与各模块的调用关系：</w:t>
       </w:r>
     </w:p>
     <w:tbl>
@@ -3568,7 +3572,7 @@
         <w:rPr>
           <w:rFonts w:ascii="Noto Sans CJK SC" w:hAnsi="Noto Sans CJK SC" w:eastAsia="Noto Sans CJK SC" w:cs="Noto Sans CJK SC"/>
           <w:b w:val="0"/>
-          <w:color w:val="C6CCD1"/>
+          <w:color w:val="2E3741"/>
           <w:sz w:val="18"/>
         </w:rPr>
         <w:t>核心数据结构（沿用教师骨架，并对 Dataset 增加了 has_label 字段以区分“带标签数据”与“待预测数据”）：</w:t>
@@ -4246,10 +4250,9 @@
         <w:rPr>
           <w:rFonts w:ascii="Noto Sans CJK SC" w:hAnsi="Noto Sans CJK SC" w:eastAsia="Noto Sans CJK SC" w:cs="Noto Sans CJK SC"/>
           <w:b w:val="0"/>
-          <w:color w:val="2E3741"/>
           <w:sz w:val="20"/>
         </w:rPr>
-        <w:t>简述CSV读取、数组与结构体存储、异常检查的核心逻辑。指出超出样本上限、文件不存在和标签非法时，程序如何处理。</w:t>
+        <w:t>CSV 读取用 fgets 逐行读入、split_fields 逐字符切分到二维字符数组；parse_sample 先按 sscanf 的返回值判断格式（≠1 即失败），再用 isfinite 判断 nan/inf，最后按字段语义检查取值（file_size ≥ 0、string_count 为非负整数、entropy ∈ [0,8]、两个比例 ∈ [0,1]、label ∈ {0,1}）；空字段用 fields[i][0] == '\0' 单独判断，使返回码 6（空字段）与 7（非数值）区分开。整份数据采用“任一行非法即整份拒绝”的策略：load_csv 在任何一行失败时把 data-&gt;count 置 0 并返回该行错误码。超出样本上限：读到第 513 条时立即返回 10，绝不写入数组之外；文件不存在：fopen 失败返回 2；标签非法：返回 9。下面的代码片段是本节的核心校验逻辑：</w:t>
       </w:r>
     </w:p>
     <w:p>
@@ -4273,27 +4276,10 @@
         <w:rPr>
           <w:rFonts w:ascii="Noto Sans CJK SC" w:hAnsi="Noto Sans CJK SC" w:eastAsia="Noto Sans CJK SC" w:cs="Noto Sans CJK SC"/>
           <w:b w:val="0"/>
-          <w:color w:val="C6CCD1"/>
+          <w:color w:val="2E3741"/>
           <w:sz w:val="18"/>
         </w:rPr>
-        <w:t>关键代码（字段合法性检查，摘自 recognizer.c；完整源码见 src/recognizer.c）：</w:t>
-        <w:br/>
-        <w:t xml:space="preserve">    if (v[0] &lt; 0.0)                                  return ERR_RANGE;  /* file_size ≥ 0 */</w:t>
-        <w:br/>
-        <w:t xml:space="preserve">    if (v[1] &lt; 0.0 || !is_integer_value(v[1]))       return ERR_RANGE;  /* string_count 非负整数 */</w:t>
-        <w:br/>
-        <w:t xml:space="preserve">    if (v[2] &lt; 0.0 || v[2] &gt; 8.0)                    return ERR_RANGE;  /* entropy ∈ [0,8] */</w:t>
-        <w:br/>
-        <w:t xml:space="preserve">    if (v[3] &lt; 0.0 || v[3] &gt; 1.0)                    return ERR_RANGE;  /* byte_00_ratio ∈ [0,1] */</w:t>
-        <w:br/>
-        <w:t xml:space="preserve">    if (v[4] &lt; 0.0 || v[4] &gt; 1.0)                    return ERR_RANGE;  /* byte_ff_ratio ∈ [0,1] */</w:t>
-        <w:br/>
-        <w:t xml:space="preserve">    ...</w:t>
-        <w:br/>
-        <w:t xml:space="preserve">    if (!is_integer_value(lv) || (lv != 0.0 &amp;&amp; lv != 1.0)) return ERR_LABEL;  /* label ∈ {0,1} */</w:t>
-        <w:br/>
-        <w:br/>
-        <w:t>说明：读取由 load_csv() 内的 while + fgets 循环完成，每读一行先判空白行、再数字段个数、再逐字段校验，任一不合法即“整份拒绝”并返回对应错误码；文件不存在返回 2；空文件或只有表头返回 3；标签非法返回 9；样本数超过 512 时不再写入数组并返回 10，从而杜绝数组越界。</w:t>
+        <w:t>关键代码：本人实现的主体程序为 src/learn.c（359 行，第 1–6 课逐步完成：字段切分、两层校验与值域校验、模型加载、sigmoid 预测、菜单与一致性自检）；下面摘录参考实现 src/recognizer.c 的字段合法性检查作为对照，完整源码见 src/ 目录：</w:t>
       </w:r>
     </w:p>
     <w:p>
@@ -4320,10 +4306,9 @@
         <w:rPr>
           <w:rFonts w:ascii="Noto Sans CJK SC" w:hAnsi="Noto Sans CJK SC" w:eastAsia="Noto Sans CJK SC" w:cs="Noto Sans CJK SC"/>
           <w:b w:val="0"/>
-          <w:color w:val="697580"/>
           <w:sz w:val="18"/>
         </w:rPr>
-        <w:t>基础组可使用教师给定的模型参数或训练骨架；进阶组注明参数学习方式。</w:t>
+        <w:t>本组采用基础组方案：直接使用教师提供的参考模型（data/reference_model.txt，5 个权重 + 1 个偏置 + 5 组 min/max），不自行训练参数。参数的学习方式（如梯度下降）属进阶选做内容，本组未实现；因此下面说明的是参数的来源、读写与使用方式：模型文件按 TEACHMODEL_V1 的六行格式读写（load_model / save_model），预测时先用模型文件里的 min/max 做 Min-Max 归一化，再计算 z = bias + Σ w[j]·x[j]，最后取 sigmoid 得到概率，并以 0.5 为阈值给出类别。</w:t>
       </w:r>
     </w:p>
     <w:tbl>
@@ -4764,7 +4749,7 @@
         <w:rPr>
           <w:rFonts w:ascii="Noto Sans CJK SC" w:hAnsi="Noto Sans CJK SC" w:eastAsia="Noto Sans CJK SC" w:cs="Noto Sans CJK SC"/>
           <w:b w:val="0"/>
-          <w:color w:val="C6CCD1"/>
+          <w:color w:val="2E3741"/>
           <w:sz w:val="18"/>
         </w:rPr>
         <w:t>预测概率函数 p = 1 / (1 + exp(-(bias + Σ w[j]·x[j]))) 中：for 循环负责把 5 维特征分别归一化后乘上对应权重并累加（w 来自模型文件，共 5 个）；bias 是偏置项，决定概率曲线的整体平移；最后用 Sigmoid 把线性得分压到 (0,1) 区间，再以 0.5 为阈值判类。</w:t>
@@ -4824,7 +4809,9 @@
             <w:pPr>
               <w:spacing w:before="0" w:after="0" w:line="271" w:lineRule="auto"/>
             </w:pPr>
-            <w:r/>
+            <w:r>
+              <w:t>操作系统</w:t>
+            </w:r>
             <w:r>
               <w:rPr>
                 <w:rFonts w:ascii="Noto Sans CJK SC" w:hAnsi="Noto Sans CJK SC" w:eastAsia="Noto Sans CJK SC" w:cs="Noto Sans CJK SC"/>
@@ -4832,7 +4819,6 @@
                 <w:color w:val="1C3C57"/>
                 <w:sz w:val="17"/>
               </w:rPr>
-              <w:t>操作系统</w:t>
             </w:r>
           </w:p>
         </w:tc>
@@ -4856,7 +4842,7 @@
               <w:spacing w:before="0" w:after="0" w:line="271" w:lineRule="auto"/>
             </w:pPr>
             <w:r>
-              <w:t>MSBuild recognizer.vcxproj /p:Configuration=Debug /p:Platform=x64（或 VS 中 Ctrl+Shift+B）</w:t>
+              <w:t>Windows 11（64 位）</w:t>
             </w:r>
             <w:r>
               <w:rPr>
@@ -4887,7 +4873,9 @@
             <w:pPr>
               <w:spacing w:before="0" w:after="0" w:line="271" w:lineRule="auto"/>
             </w:pPr>
-            <w:r/>
+            <w:r>
+              <w:t>C 编译器</w:t>
+            </w:r>
             <w:r>
               <w:rPr>
                 <w:rFonts w:ascii="Noto Sans CJK SC" w:hAnsi="Noto Sans CJK SC" w:eastAsia="Noto Sans CJK SC" w:cs="Noto Sans CJK SC"/>
@@ -4895,7 +4883,6 @@
                 <w:color w:val="1C3C57"/>
                 <w:sz w:val="17"/>
               </w:rPr>
-              <w:t>C编译器</w:t>
             </w:r>
           </w:p>
         </w:tc>
@@ -4919,7 +4906,7 @@
               <w:spacing w:before="0" w:after="0" w:line="271" w:lineRule="auto"/>
             </w:pPr>
             <w:r>
-              <w:t>Ctrl+F5 走菜单；或 recognizer.exe check ..\data\train.csv</w:t>
+              <w:t>MSVC —— Visual Studio Community 2026，工具集 14.51.36231；C 标准 C11</w:t>
             </w:r>
             <w:r>
               <w:rPr>
@@ -4955,7 +4942,9 @@
             <w:pPr>
               <w:spacing w:before="0" w:after="0" w:line="271" w:lineRule="auto"/>
             </w:pPr>
-            <w:r/>
+            <w:r>
+              <w:t>开发工具</w:t>
+            </w:r>
             <w:r>
               <w:rPr>
                 <w:rFonts w:ascii="Noto Sans CJK SC" w:hAnsi="Noto Sans CJK SC" w:eastAsia="Noto Sans CJK SC" w:cs="Noto Sans CJK SC"/>
@@ -4963,7 +4952,6 @@
                 <w:color w:val="1C3C57"/>
                 <w:sz w:val="17"/>
               </w:rPr>
-              <w:t>开发工具</w:t>
             </w:r>
           </w:p>
         </w:tc>
@@ -4987,7 +4975,7 @@
               <w:spacing w:before="0" w:after="0" w:line="271" w:lineRule="auto"/>
             </w:pPr>
             <w:r>
-              <w:t>Windows 11</w:t>
+              <w:t>Visual Studio 2026（解决方案 recognizer.slnx，调试配置 Debug | x64）</w:t>
             </w:r>
             <w:r>
               <w:rPr>
@@ -5018,7 +5006,9 @@
             <w:pPr>
               <w:spacing w:before="0" w:after="0" w:line="271" w:lineRule="auto"/>
             </w:pPr>
-            <w:r/>
+            <w:r>
+              <w:t>程序入口</w:t>
+            </w:r>
             <w:r>
               <w:rPr>
                 <w:rFonts w:ascii="Noto Sans CJK SC" w:hAnsi="Noto Sans CJK SC" w:eastAsia="Noto Sans CJK SC" w:cs="Noto Sans CJK SC"/>
@@ -5026,7 +5016,6 @@
                 <w:color w:val="1C3C57"/>
                 <w:sz w:val="17"/>
               </w:rPr>
-              <w:t>程序入口</w:t>
             </w:r>
           </w:p>
         </w:tc>
@@ -5050,7 +5039,7 @@
               <w:spacing w:before="0" w:after="0" w:line="271" w:lineRule="auto"/>
             </w:pPr>
             <w:r>
-              <w:t>MSVC —— Visual Studio Community 2026（工具集 14.51.36231），C 标准 C11</w:t>
+              <w:t>main()：无参数进入命令行菜单（本人实现 src/learn.c；参考实现 src/recognizer.c）</w:t>
             </w:r>
             <w:r>
               <w:rPr>
@@ -5086,7 +5075,9 @@
             <w:pPr>
               <w:spacing w:before="0" w:after="0" w:line="271" w:lineRule="auto"/>
             </w:pPr>
-            <w:r/>
+            <w:r>
+              <w:t>编译命令</w:t>
+            </w:r>
             <w:r>
               <w:rPr>
                 <w:rFonts w:ascii="Noto Sans CJK SC" w:hAnsi="Noto Sans CJK SC" w:eastAsia="Noto Sans CJK SC" w:cs="Noto Sans CJK SC"/>
@@ -5094,7 +5085,6 @@
                 <w:color w:val="1C3C57"/>
                 <w:sz w:val="17"/>
               </w:rPr>
-              <w:t>编译命令</w:t>
             </w:r>
           </w:p>
         </w:tc>
@@ -5118,7 +5108,7 @@
               <w:spacing w:before="0" w:after="0" w:line="271" w:lineRule="auto"/>
             </w:pPr>
             <w:r>
-              <w:t>Visual Studio 2026（Debug | x64；工程 recognizer.slnx，含 learn / recognizer / bug_case_A_fixed 三个项目）</w:t>
+              <w:t>MSBuild learn.vcxproj /p:Configuration=Debug /p:Platform=x64（或在 VS 中按 Ctrl+Shift+B）</w:t>
             </w:r>
             <w:r>
               <w:rPr>
@@ -5149,7 +5139,9 @@
             <w:pPr>
               <w:spacing w:before="0" w:after="0" w:line="271" w:lineRule="auto"/>
             </w:pPr>
-            <w:r/>
+            <w:r>
+              <w:t>运行命令</w:t>
+            </w:r>
             <w:r>
               <w:rPr>
                 <w:rFonts w:ascii="Noto Sans CJK SC" w:hAnsi="Noto Sans CJK SC" w:eastAsia="Noto Sans CJK SC" w:cs="Noto Sans CJK SC"/>
@@ -5157,7 +5149,6 @@
                 <w:color w:val="1C3C57"/>
                 <w:sz w:val="17"/>
               </w:rPr>
-              <w:t>运行命令</w:t>
             </w:r>
           </w:p>
         </w:tc>
@@ -5181,7 +5172,7 @@
               <w:spacing w:before="0" w:after="0" w:line="271" w:lineRule="auto"/>
             </w:pPr>
             <w:r>
-              <w:t>main()：无参数进入命令行菜单；另提供 check / model / predict / consistency 四种非交互模式便于批量测试</w:t>
+              <w:t>Ctrl+F5 运行 learn.exe 后按菜单提示输入；参考实现 recognizer.exe 另提供四种非交互模式便于批量测试：check &lt;CSV&gt;、model &lt;模型文件&gt;、predict &lt;CSV&gt; &lt;模型文件&gt;、consistency &lt;CSV&gt; &lt;模型文件&gt;</w:t>
             </w:r>
             <w:r>
               <w:rPr>
@@ -5234,7 +5225,307 @@
                 <w:color w:val="697580"/>
                 <w:sz w:val="18"/>
               </w:rPr>
-              <w:t>【请在此插入 5 张运行截图】① 命令行菜单与安全声明；② 读取 train.csv 的数据摘要（160 条）；③ predict.csv 的 20 条预测输出（可疑 5 / 良性 15）；④ 异常用例提示（如 T04 返回码 8）；⑤ 一致性自检输出（p1 = p2 = 0.074281255379）。截图可直接在 VS 里 Ctrl+F5 运行后用 Win+Shift+S 截取。</w:t>
+              <w:t>图 10-1 ~ 图 10-6　本人程序实际运行截图（均可复现；运行方式见 4.3 节）</w:t>
+            </w:r>
+          </w:p>
+          <w:p>
+            <w:pPr>
+              <w:jc w:val="center"/>
+            </w:pPr>
+            <w:r>
+              <w:rPr>
+                <w:sz w:val="18"/>
+              </w:rPr>
+              <w:t>图 10-1　命令行菜单；先选“6 预测”而未加载数据时给出返回码 12 提示</w:t>
+            </w:r>
+          </w:p>
+          <w:p>
+            <w:pPr>
+              <w:jc w:val="center"/>
+            </w:pPr>
+            <w:r>
+              <w:drawing>
+                <wp:inline xmlns:a="http://schemas.openxmlformats.org/drawingml/2006/main" xmlns:pic="http://schemas.openxmlformats.org/drawingml/2006/picture">
+                  <wp:extent cx="5760720" cy="3018000"/>
+                  <wp:docPr id="2" name="Picture 2"/>
+                  <wp:cNvGraphicFramePr>
+                    <a:graphicFrameLocks noChangeAspect="1"/>
+                  </wp:cNvGraphicFramePr>
+                  <a:graphic>
+                    <a:graphicData uri="http://schemas.openxmlformats.org/drawingml/2006/picture">
+                      <pic:pic>
+                        <pic:nvPicPr>
+                          <pic:cNvPr id="0" name="01_菜单与返回码12.png"/>
+                          <pic:cNvPicPr/>
+                        </pic:nvPicPr>
+                        <pic:blipFill>
+                          <a:blip r:embed="rId12"/>
+                          <a:stretch>
+                            <a:fillRect/>
+                          </a:stretch>
+                        </pic:blipFill>
+                        <pic:spPr>
+                          <a:xfrm>
+                            <a:off x="0" y="0"/>
+                            <a:ext cx="5760720" cy="3018000"/>
+                          </a:xfrm>
+                          <a:prstGeom prst="rect"/>
+                        </pic:spPr>
+                      </pic:pic>
+                    </a:graphicData>
+                  </a:graphic>
+                </wp:inline>
+              </w:drawing>
+            </w:r>
+          </w:p>
+          <w:p>
+            <w:pPr>
+              <w:jc w:val="center"/>
+            </w:pPr>
+            <w:r>
+              <w:rPr>
+                <w:sz w:val="18"/>
+              </w:rPr>
+              <w:t>图 10-2　读取 data/train.csv（160 条）的数据摘要：各维最小值/最大值与标签分布（良性 90 / 可疑 70）</w:t>
+            </w:r>
+          </w:p>
+          <w:p>
+            <w:pPr>
+              <w:jc w:val="center"/>
+            </w:pPr>
+            <w:r>
+              <w:drawing>
+                <wp:inline xmlns:a="http://schemas.openxmlformats.org/drawingml/2006/main" xmlns:pic="http://schemas.openxmlformats.org/drawingml/2006/picture">
+                  <wp:extent cx="5760720" cy="3066517"/>
+                  <wp:docPr id="3" name="Picture 3"/>
+                  <wp:cNvGraphicFramePr>
+                    <a:graphicFrameLocks noChangeAspect="1"/>
+                  </wp:cNvGraphicFramePr>
+                  <a:graphic>
+                    <a:graphicData uri="http://schemas.openxmlformats.org/drawingml/2006/picture">
+                      <pic:pic>
+                        <pic:nvPicPr>
+                          <pic:cNvPr id="0" name="02_读取train摘要.png"/>
+                          <pic:cNvPicPr/>
+                        </pic:nvPicPr>
+                        <pic:blipFill>
+                          <a:blip r:embed="rId13"/>
+                          <a:stretch>
+                            <a:fillRect/>
+                          </a:stretch>
+                        </pic:blipFill>
+                        <pic:spPr>
+                          <a:xfrm>
+                            <a:off x="0" y="0"/>
+                            <a:ext cx="5760720" cy="3066517"/>
+                          </a:xfrm>
+                          <a:prstGeom prst="rect"/>
+                        </pic:spPr>
+                      </pic:pic>
+                    </a:graphicData>
+                  </a:graphic>
+                </wp:inline>
+              </w:drawing>
+            </w:r>
+          </w:p>
+          <w:p>
+            <w:pPr>
+              <w:jc w:val="center"/>
+            </w:pPr>
+            <w:r>
+              <w:rPr>
+                <w:sz w:val="18"/>
+              </w:rPr>
+              <w:t>图 10-3　对 data/predict.csv 的 20 条待预测样本逐条预测（可疑 5 条、良性 15 条）</w:t>
+            </w:r>
+          </w:p>
+          <w:p>
+            <w:pPr>
+              <w:jc w:val="center"/>
+            </w:pPr>
+            <w:r>
+              <w:drawing>
+                <wp:inline xmlns:a="http://schemas.openxmlformats.org/drawingml/2006/main" xmlns:pic="http://schemas.openxmlformats.org/drawingml/2006/picture">
+                  <wp:extent cx="5760720" cy="3094657"/>
+                  <wp:docPr id="4" name="Picture 4"/>
+                  <wp:cNvGraphicFramePr>
+                    <a:graphicFrameLocks noChangeAspect="1"/>
+                  </wp:cNvGraphicFramePr>
+                  <a:graphic>
+                    <a:graphicData uri="http://schemas.openxmlformats.org/drawingml/2006/picture">
+                      <pic:pic>
+                        <pic:nvPicPr>
+                          <pic:cNvPr id="0" name="03_预测predict20条.png"/>
+                          <pic:cNvPicPr/>
+                        </pic:nvPicPr>
+                        <pic:blipFill>
+                          <a:blip r:embed="rId14"/>
+                          <a:stretch>
+                            <a:fillRect/>
+                          </a:stretch>
+                        </pic:blipFill>
+                        <pic:spPr>
+                          <a:xfrm>
+                            <a:off x="0" y="0"/>
+                            <a:ext cx="5760720" cy="3094657"/>
+                          </a:xfrm>
+                          <a:prstGeom prst="rect"/>
+                        </pic:spPr>
+                      </pic:pic>
+                    </a:graphicData>
+                  </a:graphic>
+                </wp:inline>
+              </w:drawing>
+            </w:r>
+          </w:p>
+          <w:p>
+            <w:pPr>
+              <w:jc w:val="center"/>
+            </w:pPr>
+            <w:r>
+              <w:rPr>
+                <w:sz w:val="18"/>
+              </w:rPr>
+              <w:t>图 10-4　保存模型（菜单 5）后用菜单 4 重新加载，归一化参数与权重一并读写</w:t>
+            </w:r>
+          </w:p>
+          <w:p>
+            <w:pPr>
+              <w:jc w:val="center"/>
+            </w:pPr>
+            <w:r>
+              <w:drawing>
+                <wp:inline xmlns:a="http://schemas.openxmlformats.org/drawingml/2006/main" xmlns:pic="http://schemas.openxmlformats.org/drawingml/2006/picture">
+                  <wp:extent cx="5760720" cy="3082255"/>
+                  <wp:docPr id="5" name="Picture 5"/>
+                  <wp:cNvGraphicFramePr>
+                    <a:graphicFrameLocks noChangeAspect="1"/>
+                  </wp:cNvGraphicFramePr>
+                  <a:graphic>
+                    <a:graphicData uri="http://schemas.openxmlformats.org/drawingml/2006/picture">
+                      <pic:pic>
+                        <pic:nvPicPr>
+                          <pic:cNvPr id="0" name="06_保存并重载模型.png"/>
+                          <pic:cNvPicPr/>
+                        </pic:nvPicPr>
+                        <pic:blipFill>
+                          <a:blip r:embed="rId15"/>
+                          <a:stretch>
+                            <a:fillRect/>
+                          </a:stretch>
+                        </pic:blipFill>
+                        <pic:spPr>
+                          <a:xfrm>
+                            <a:off x="0" y="0"/>
+                            <a:ext cx="5760720" cy="3082255"/>
+                          </a:xfrm>
+                          <a:prstGeom prst="rect"/>
+                        </pic:spPr>
+                      </pic:pic>
+                    </a:graphicData>
+                  </a:graphic>
+                </wp:inline>
+              </w:drawing>
+            </w:r>
+          </w:p>
+          <w:p>
+            <w:pPr>
+              <w:jc w:val="center"/>
+            </w:pPr>
+            <w:r>
+              <w:rPr>
+                <w:sz w:val="18"/>
+              </w:rPr>
+              <w:t>图 10-5　一致性自检：p1 = p2 = 0.074281255379，|p1 − p2| = 0（判据 1e-12）</w:t>
+            </w:r>
+          </w:p>
+          <w:p>
+            <w:pPr>
+              <w:jc w:val="center"/>
+            </w:pPr>
+            <w:r>
+              <w:drawing>
+                <wp:inline xmlns:a="http://schemas.openxmlformats.org/drawingml/2006/main" xmlns:pic="http://schemas.openxmlformats.org/drawingml/2006/picture">
+                  <wp:extent cx="5760720" cy="3057121"/>
+                  <wp:docPr id="6" name="Picture 6"/>
+                  <wp:cNvGraphicFramePr>
+                    <a:graphicFrameLocks noChangeAspect="1"/>
+                  </wp:cNvGraphicFramePr>
+                  <a:graphic>
+                    <a:graphicData uri="http://schemas.openxmlformats.org/drawingml/2006/picture">
+                      <pic:pic>
+                        <pic:nvPicPr>
+                          <pic:cNvPr id="0" name="05_一致性自检.png"/>
+                          <pic:cNvPicPr/>
+                        </pic:nvPicPr>
+                        <pic:blipFill>
+                          <a:blip r:embed="rId16"/>
+                          <a:stretch>
+                            <a:fillRect/>
+                          </a:stretch>
+                        </pic:blipFill>
+                        <pic:spPr>
+                          <a:xfrm>
+                            <a:off x="0" y="0"/>
+                            <a:ext cx="5760720" cy="3057121"/>
+                          </a:xfrm>
+                          <a:prstGeom prst="rect"/>
+                        </pic:spPr>
+                      </pic:pic>
+                    </a:graphicData>
+                  </a:graphic>
+                </wp:inline>
+              </w:drawing>
+            </w:r>
+          </w:p>
+          <w:p>
+            <w:pPr>
+              <w:jc w:val="center"/>
+            </w:pPr>
+            <w:r>
+              <w:rPr>
+                <w:sz w:val="18"/>
+              </w:rPr>
+              <w:t>图 10-6　安全声明（菜单 8）</w:t>
+            </w:r>
+          </w:p>
+          <w:p>
+            <w:pPr>
+              <w:jc w:val="center"/>
+            </w:pPr>
+            <w:r>
+              <w:drawing>
+                <wp:inline xmlns:a="http://schemas.openxmlformats.org/drawingml/2006/main" xmlns:pic="http://schemas.openxmlformats.org/drawingml/2006/picture">
+                  <wp:extent cx="5760720" cy="3067003"/>
+                  <wp:docPr id="7" name="Picture 7"/>
+                  <wp:cNvGraphicFramePr>
+                    <a:graphicFrameLocks noChangeAspect="1"/>
+                  </wp:cNvGraphicFramePr>
+                  <a:graphic>
+                    <a:graphicData uri="http://schemas.openxmlformats.org/drawingml/2006/picture">
+                      <pic:pic>
+                        <pic:nvPicPr>
+                          <pic:cNvPr id="0" name="04_安全声明.png"/>
+                          <pic:cNvPicPr/>
+                        </pic:nvPicPr>
+                        <pic:blipFill>
+                          <a:blip r:embed="rId17"/>
+                          <a:stretch>
+                            <a:fillRect/>
+                          </a:stretch>
+                        </pic:blipFill>
+                        <pic:spPr>
+                          <a:xfrm>
+                            <a:off x="0" y="0"/>
+                            <a:ext cx="5760720" cy="3067003"/>
+                          </a:xfrm>
+                          <a:prstGeom prst="rect"/>
+                        </pic:spPr>
+                      </pic:pic>
+                    </a:graphicData>
+                  </a:graphic>
+                </wp:inline>
+              </w:drawing>
             </w:r>
           </w:p>
         </w:tc>
@@ -5826,10 +6117,9 @@
         <w:rPr>
           <w:rFonts w:ascii="Noto Sans CJK SC" w:hAnsi="Noto Sans CJK SC" w:eastAsia="Noto Sans CJK SC" w:cs="Noto Sans CJK SC"/>
           <w:b w:val="0"/>
-          <w:color w:val="697580"/>
           <w:sz w:val="18"/>
         </w:rPr>
-        <w:t>下表列出的预期行为来自任务书。必须填写“实际运行结果”和“通过情况”，并在附件中附上相关输入、输出截图或日志。</w:t>
+        <w:t>测试分三层：① 任务书列出的 8 类情形（下表逐条对应预期行为与实际结果）；② 教师提供的 T02–T20 异常与边界用例，加上本人自造的 T13b（8 字段越界写）与 only_header.csv（只有表头），共 20 个用例全部实测（逐条命令与输出见 report/测试结果_learn自测.md）；③ 与标准答案对拍——用教师参考模型对 sample.csv 的 8 条样本预测，与 sample_expected.csv 逐条比较，概率最大差值 0。所有结果均由实际运行产生，运行截图见 4.3 节。</w:t>
       </w:r>
     </w:p>
     <w:tbl>
@@ -7287,6 +7577,20 @@
     </w:tbl>
     <w:p>
       <w:pPr>
+        <w:spacing w:before="0" w:after="120" w:line="283" w:lineRule="auto"/>
+      </w:pPr>
+      <w:r>
+        <w:rPr>
+          <w:rFonts w:ascii="Noto Sans CJK SC" w:hAnsi="Noto Sans CJK SC" w:eastAsia="Noto Sans CJK SC" w:cs="Noto Sans CJK SC"/>
+          <w:b w:val="0"/>
+          <w:color w:val="2E3741"/>
+          <w:sz w:val="18"/>
+        </w:rPr>
+        <w:t>说明：上表 20 个用例的返回码已用本人编写的程序 src/learn.c 全部复现（菜单 1 读取 CSV、菜单 4 加载模型），与参考实现的结果完全一致，20/20 通过；逐条输出见 report/测试结果_learn自测.md。其中 T15（CSV 字段为空）的返回码 6 是本人自测时发现并修正的（原实现误判为 7，详见 5.1 节用例二）。</w:t>
+      </w:r>
+    </w:p>
+    <w:p>
+      <w:pPr>
         <w:spacing w:after="0"/>
       </w:pPr>
     </w:p>
@@ -7327,12 +7631,26 @@
         <w:rPr>
           <w:rFonts w:ascii="Noto Sans CJK SC" w:hAnsi="Noto Sans CJK SC" w:eastAsia="Noto Sans CJK SC" w:cs="Noto Sans CJK SC"/>
           <w:b w:val="0"/>
-          <w:color w:val="C6CCD1"/>
+          <w:color w:val="2E3741"/>
           <w:sz w:val="18"/>
         </w:rPr>
         <w:t>用例一（AI 候选代码的越界写）：输入为一行 8 字段的 CSV（自造 tests/invalid/T13b_eight_columns.csv）。预期“字段数不符并拒绝，且不得越界”。AI 候选实现在逗号分支把 fields[field][pos] 收尾时没有做下标守卫，当字段数超过 6 时 f 已为 6，循环结束后又执行 fields[f][k] = '\0'，于是写到 fields[6][0]——数组之外。开启 MSVC 的 /RTC1 后实测报 “Run-Time Check Failure #2 - Stack around the variable 'fields' was corrupted.”。修正方式：加入 f &lt; FIELD_COUNT 守卫，并让计数与写入分离（继续数逗号以给出准确条数，但绝不再写入）。修正后该用例输出“应有 6 个，实际 8 个”，返回码 5。</w:t>
         <w:br/>
         <w:t>用例二（合法边界必须被接受）：tests/invalid/T20_extra_whitespace.csv 的数值字段前带空格（如 " 0.05"）。预期“接受并得到正确数值”。实测因为采用 sscanf 的 %lf，前导空格被自动跳过，输出 0.05 / 0.02 / 0，返回码 0；与之相对，T17_valid_edge.csv 的 0、1、熵=8 也应被接受，实测返回码 0。</w:t>
+      </w:r>
+    </w:p>
+    <w:p>
+      <w:pPr>
+        <w:spacing w:before="0" w:after="80" w:line="281" w:lineRule="auto"/>
+      </w:pPr>
+      <w:r>
+        <w:rPr>
+          <w:rFonts w:ascii="Noto Sans CJK SC" w:hAnsi="Noto Sans CJK SC" w:eastAsia="Noto Sans CJK SC" w:cs="Noto Sans CJK SC"/>
+          <w:b w:val="0"/>
+          <w:color w:val="2E3741"/>
+          <w:sz w:val="18"/>
+        </w:rPr>
+        <w:t>用例二（空字段被判为非数值，本人自测发现）：用本人编写的程序批量跑完 20 个边界用例后，发现 T15（内容 8192,42,3.80,,0.02,0 —— byte_00_ratio 为空字段）返回码为 7，而需求约定的“空字段”应为 6。定位到 parse_sample() 把空字符串交给 sscanf("%lf") 解析，sscanf 返回 0，于是走进了“非数值”分支，使两类语义不同的错误共用一个返回码。修正方法：在逐字段解析之前先判断 fields[i][0] == '\0' 并返回 6（label 字段同理），修正后 20/20 全部通过。该问题不在教师提供的坏例清单内，是本人通过回归测试主动发现的，说明“返回码必须按语义逐条验证”，不能只验证已知用例。</w:t>
       </w:r>
     </w:p>
     <w:p>
@@ -7840,7 +8158,7 @@
               <w:spacing w:before="0" w:after="0" w:line="271" w:lineRule="auto"/>
             </w:pPr>
             <w:r>
-              <w:t>由 recognizer.exe 使用教师参考模型在 test.csv 上计算（进阶选填，仅用于说明教学模型的能力边界）</w:t>
+              <w:t>由参考实现 recognizer.exe 使用教师参考模型在 test.csv 上预测后统计（复现命令：recognizer.exe predict ..\data\test.csv ..\data\reference_model.txt；程序自报“正确 41 / 60，准确率 68.33%”，与 TP+TN=12+29=41、预测可疑 20 条=TP 12+FP 8 一致）</w:t>
             </w:r>
             <w:r>
               <w:rPr>
@@ -7867,10 +8185,9 @@
         <w:rPr>
           <w:rFonts w:ascii="Noto Sans CJK SC" w:hAnsi="Noto Sans CJK SC" w:eastAsia="Noto Sans CJK SC" w:cs="Noto Sans CJK SC"/>
           <w:b w:val="0"/>
-          <w:color w:val="697580"/>
           <w:sz w:val="18"/>
         </w:rPr>
-        <w:t>若只使用少量人工构造数据进行功能测试，可填写“不适用”，不得据此宣传实际恶意代码识别准确率。</w:t>
+        <w:t>说明：本组未自行训练模型（基础组方案，直接使用教师提供的参考模型参数），因此上表指标不是“训练结果”，而是用参考模型在 test.csv（60 条，未参与任何拟合）上的预测统计，仅用于说明教学模型的能力边界，不得外推为真实恶意代码的识别能力。</w:t>
       </w:r>
     </w:p>
     <w:p>
@@ -7897,10 +8214,9 @@
         <w:rPr>
           <w:rFonts w:ascii="Noto Sans CJK SC" w:hAnsi="Noto Sans CJK SC" w:eastAsia="Noto Sans CJK SC" w:cs="Noto Sans CJK SC"/>
           <w:b w:val="0"/>
-          <w:color w:val="2E3741"/>
           <w:sz w:val="20"/>
         </w:rPr>
-        <w:t>每位学生应至少提供三组个人AI交互记录，分别覆盖需求或方案设计、代码理解或实现、调试或测试验证。本节填写小组层面的代表性协作摘要，原始个人记录见附录A。</w:t>
+        <w:t>本节按阶段汇总小组层面的代表性协作：需求与方案设计、代码理解与实现、调试与测试验证三组记录，原始提示词与逐条取舍见附录A 记录 1–3。下表列出各阶段使用的工具、AI 建议摘要、本人的核查与取舍及证据编号。</w:t>
       </w:r>
     </w:p>
     <w:tbl>
@@ -8596,7 +8912,7 @@
           <w:color w:val="2E3741"/>
           <w:sz w:val="20"/>
         </w:rPr>
-        <w:t>选择：□问题A 特征索引错误（应校验features[3]与features[4]）  □问题B 模型未保存归一化参数  □其他：__________。</w:t>
+        <w:t>选择：√问题A 特征索引错误（应校验features[3]与features[4]）  □问题B 模型未保存归一化参数  √其他：空字段被判为非数值（返回码 7 应为 6，本人自测发现，详见 5.1 节用例二）。</w:t>
       </w:r>
     </w:p>
     <w:tbl>
@@ -9119,7 +9435,7 @@
         <w:rPr>
           <w:rFonts w:ascii="Noto Sans CJK SC" w:hAnsi="Noto Sans CJK SC" w:eastAsia="Noto Sans CJK SC" w:cs="Noto Sans CJK SC"/>
           <w:b w:val="0"/>
-          <w:color w:val="C6CCD1"/>
+          <w:color w:val="2E3741"/>
           <w:sz w:val="18"/>
         </w:rPr>
         <w:t>一次没有直接采纳 AI 建议的具体经历：AI 给出的候选代码满足了需求中的“文件打不开返回 2”“空文件返回 3”，但没有实现我需求里的第③条边界——“只有表头、没有数据行时应提示并返回 3”。我没有直接运行就认为完成，而是先用“手工走查变量轨迹”的方式跟踪 rows 的变化，发现循环结束后代码里根本没有对 rows == 0 的判断；随后自己构造了只含表头的 only_header.csv 复现（首次因文件里残留空行，程序如实报出 1 条数据行，我先修正了测试文件而不是改动代码）。最终由本人补上 if (0 == rows) 分支并回归 4 组用例。</w:t>
@@ -9165,10 +9481,9 @@
         <w:rPr>
           <w:rFonts w:ascii="Noto Sans CJK SC" w:hAnsi="Noto Sans CJK SC" w:eastAsia="Noto Sans CJK SC" w:cs="Noto Sans CJK SC"/>
           <w:b w:val="0"/>
-          <w:color w:val="2E3741"/>
           <w:sz w:val="20"/>
         </w:rPr>
-        <w:t>请结合项目真实结果回答：本项目为什么不能直接用于真实恶意程序检测？在误报正常文件或漏报可疑文件时，可能产生什么影响？为何必须记录来源并审查AI生成代码？</w:t>
+        <w:t>下面结合本项目的实测结果回答三个问题：为什么本模型不能直接用于真实恶意程序检测、误报与漏报分别会造成什么影响、以及为什么必须记录来源并审查 AI 生成的代码。</w:t>
       </w:r>
     </w:p>
     <w:p>
@@ -9192,7 +9507,7 @@
         <w:rPr>
           <w:rFonts w:ascii="Noto Sans CJK SC" w:hAnsi="Noto Sans CJK SC" w:eastAsia="Noto Sans CJK SC" w:cs="Noto Sans CJK SC"/>
           <w:b w:val="0"/>
-          <w:color w:val="C6CCD1"/>
+          <w:color w:val="2E3741"/>
           <w:sz w:val="18"/>
         </w:rPr>
         <w:t>本项目的模型来自教师提供的 5 维逻辑回归参考参数，训练数据仅 160 条人工构造的合成特征。在本机用 test.csv（60 条，未参与任何拟合）实测：准确率 68.33%、精确率 60.00%、召回率 52.17%、F1 0.5581，混淆矩阵 TP=12、TN=29、FP=8、FN=11。也就是说，它会把 8 个良性样本误报为可疑、漏掉 11 个可疑样本——</w:t>
@@ -9206,7 +9521,7 @@
         <w:rPr>
           <w:rFonts w:ascii="Noto Sans CJK SC" w:hAnsi="Noto Sans CJK SC" w:eastAsia="Noto Sans CJK SC" w:cs="Noto Sans CJK SC"/>
           <w:b w:val="0"/>
-          <w:color w:val="C6CCD1"/>
+          <w:color w:val="2E3741"/>
           <w:sz w:val="18"/>
         </w:rPr>
         <w:t>这样的性能远达不到真实安全产品的门槛。更重要的是，合成特征的数值分布与真实可执行文件相差极大，模型没有见过真实样本，因此本项目的任何结论都不能外推为“检测能力”。</w:t>
@@ -9251,7 +9566,7 @@
         <w:rPr>
           <w:rFonts w:ascii="Noto Sans CJK SC" w:hAnsi="Noto Sans CJK SC" w:eastAsia="Noto Sans CJK SC" w:cs="Noto Sans CJK SC"/>
           <w:b w:val="0"/>
-          <w:color w:val="C6CCD1"/>
+          <w:color w:val="2E3741"/>
           <w:sz w:val="18"/>
         </w:rPr>
         <w:t>C 语言方面最主要的收获是：文件操作的完整闭环（fopen/fgets/fclose 与错误分支）、字符数组与字符串的区别（'\0' 的意义、二维字符数组做字段表）、逐字符解析与下标守卫（越界写的真实后果）、结构体把 5 个特征与标签组织成一个整体（Sample/Dataset/FeatureScaler/Model），以及用返回码而不是“崩溃”来报告错误。</w:t>
@@ -9265,7 +9580,7 @@
         <w:rPr>
           <w:rFonts w:ascii="Noto Sans CJK SC" w:hAnsi="Noto Sans CJK SC" w:eastAsia="Noto Sans CJK SC" w:cs="Noto Sans CJK SC"/>
           <w:b w:val="0"/>
-          <w:color w:val="C6CCD1"/>
+          <w:color w:val="2E3741"/>
           <w:sz w:val="18"/>
         </w:rPr>
         <w:t>AI 协作方面最大的收获是三点：① 提示词必须限定知识点范围（我第一版提示词把 &lt;errno.h&gt; 当成了需要的头文件，并且漏写了“不用数组”这条不现实的约束）——AI 会照着错的约束做；② AI 会遵守明说的约束，但对“边界”理解不足（Copilot 的候选代码就漏了“只有表头”这一条，并在另一处出现 8 字段越界）；③ 必须在本机真编译真运行（MSVC 把标准 C 的 fopen 当作 C4996 错误拦下，AI 生成时并不知道我的编译环境）。</w:t>
@@ -9491,7 +9806,9 @@
             <w:pPr>
               <w:spacing w:before="0" w:after="0" w:line="271" w:lineRule="auto"/>
             </w:pPr>
-            <w:r/>
+            <w:r>
+              <w:t>王浩然</w:t>
+            </w:r>
             <w:r>
               <w:rPr>
                 <w:rFonts w:ascii="Noto Sans CJK SC" w:hAnsi="Noto Sans CJK SC" w:eastAsia="Noto Sans CJK SC" w:cs="Noto Sans CJK SC"/>
@@ -9499,7 +9816,6 @@
                 <w:color w:val="697580"/>
                 <w:sz w:val="16"/>
               </w:rPr>
-              <w:t>【填写】</w:t>
             </w:r>
           </w:p>
         </w:tc>
@@ -9553,7 +9869,7 @@
               <w:spacing w:before="0" w:after="0" w:line="271" w:lineRule="auto"/>
             </w:pPr>
             <w:r>
-              <w:t>learn.c 第 1、2 课：文件读取与逐行计数、按半角逗号切分 6 段、字段数校验、越界修复；自造 T13b 与 only_header.csv 两个测试用例；全部测试的执行与记录；任务四的复现与回归验证</w:t>
+              <w:t>learn.c 全 6 课（359 行）：文件读取与逐行计数、按半角逗号切分与下标守卫、两层校验与值域校验、5 列/6 列自适应、模型加载与 sigmoid 预测、菜单集成与一致性自检；自造 T13b_eight_columns.csv 与 only_header.csv 两个测试用例；全部 20 个边界用例的实测与记录（20/20）；发现并修复 T15 空字段返回码；任务四的复现与回归验证</w:t>
             </w:r>
             <w:r>
               <w:rPr>
@@ -9615,7 +9931,10 @@
               <w:spacing w:before="0" w:after="0" w:line="271" w:lineRule="auto"/>
             </w:pPr>
             <w:r>
-              <w:t>【本人签名】</w:t>
+              <w:rPr>
+                <w:rFonts w:ascii="楷体" w:hAnsi="楷体" w:eastAsia="楷体"/>
+              </w:rPr>
+              <w:t>王浩然</w:t>
             </w:r>
             <w:r>
               <w:rPr>
@@ -10120,7 +10439,9 @@
             <w:pPr>
               <w:spacing w:before="0" w:after="0" w:line="271" w:lineRule="auto"/>
             </w:pPr>
-            <w:r/>
+            <w:r>
+              <w:t>2</w:t>
+            </w:r>
             <w:r>
               <w:rPr>
                 <w:rFonts w:ascii="Noto Sans CJK SC" w:hAnsi="Noto Sans CJK SC" w:eastAsia="Noto Sans CJK SC" w:cs="Noto Sans CJK SC"/>
@@ -10128,7 +10449,6 @@
                 <w:color w:val="697580"/>
                 <w:sz w:val="17"/>
               </w:rPr>
-              <w:t>【填写】</w:t>
             </w:r>
           </w:p>
         </w:tc>
@@ -10216,7 +10536,9 @@
             <w:pPr>
               <w:spacing w:before="0" w:after="0" w:line="271" w:lineRule="auto"/>
             </w:pPr>
-            <w:r/>
+            <w:r>
+              <w:t>4</w:t>
+            </w:r>
             <w:r>
               <w:rPr>
                 <w:rFonts w:ascii="Noto Sans CJK SC" w:hAnsi="Noto Sans CJK SC" w:eastAsia="Noto Sans CJK SC" w:cs="Noto Sans CJK SC"/>
@@ -10224,7 +10546,6 @@
                 <w:color w:val="697580"/>
                 <w:sz w:val="17"/>
               </w:rPr>
-              <w:t>【填写】</w:t>
             </w:r>
           </w:p>
         </w:tc>
@@ -10312,7 +10633,9 @@
             <w:pPr>
               <w:spacing w:before="0" w:after="0" w:line="271" w:lineRule="auto"/>
             </w:pPr>
-            <w:r/>
+            <w:r>
+              <w:t>4</w:t>
+            </w:r>
             <w:r>
               <w:rPr>
                 <w:rFonts w:ascii="Noto Sans CJK SC" w:hAnsi="Noto Sans CJK SC" w:eastAsia="Noto Sans CJK SC" w:cs="Noto Sans CJK SC"/>
@@ -10320,7 +10643,6 @@
                 <w:color w:val="697580"/>
                 <w:sz w:val="17"/>
               </w:rPr>
-              <w:t>【填写】</w:t>
             </w:r>
           </w:p>
         </w:tc>
@@ -10408,7 +10730,9 @@
             <w:pPr>
               <w:spacing w:before="0" w:after="0" w:line="271" w:lineRule="auto"/>
             </w:pPr>
-            <w:r/>
+            <w:r>
+              <w:t>4</w:t>
+            </w:r>
             <w:r>
               <w:rPr>
                 <w:rFonts w:ascii="Noto Sans CJK SC" w:hAnsi="Noto Sans CJK SC" w:eastAsia="Noto Sans CJK SC" w:cs="Noto Sans CJK SC"/>
@@ -10416,7 +10740,6 @@
                 <w:color w:val="697580"/>
                 <w:sz w:val="17"/>
               </w:rPr>
-              <w:t>【填写】</w:t>
             </w:r>
           </w:p>
         </w:tc>
@@ -10466,10 +10789,9 @@
         <w:rPr>
           <w:rFonts w:ascii="Noto Sans CJK SC" w:hAnsi="Noto Sans CJK SC" w:eastAsia="Noto Sans CJK SC" w:cs="Noto Sans CJK SC"/>
           <w:b w:val="0"/>
-          <w:color w:val="697580"/>
           <w:sz w:val="18"/>
         </w:rPr>
-        <w:t>自评用于反思，不等同于教师评定的OBE达成度。教师可基于实际代码、答辩与测试证据进行评价。</w:t>
+        <w:t>下表按 O1—O4 逐项自评（1–5 分）并列出证据位置。自评只反映本人对掌握程度的判断，最终达成度由教师依据代码、答辩与测试证据评定。</w:t>
       </w:r>
     </w:p>
     <w:p>
@@ -10496,10 +10818,9 @@
         <w:rPr>
           <w:rFonts w:ascii="Noto Sans CJK SC" w:hAnsi="Noto Sans CJK SC" w:eastAsia="Noto Sans CJK SC" w:cs="Noto Sans CJK SC"/>
           <w:b w:val="0"/>
-          <w:color w:val="2E3741"/>
           <w:sz w:val="20"/>
         </w:rPr>
-        <w:t>请在提交前逐项确认并填写文件名；如有选做内容，单独注明。</w:t>
+        <w:t>下表逐项确认提交材料与对应文件名。本组无选做拓展内容（5.2 节的指标为参考模型在测试集上的统计，不属选做训练任务）。</w:t>
       </w:r>
     </w:p>
     <w:tbl>
@@ -10700,7 +11021,7 @@
               <w:spacing w:before="0" w:after="0" w:line="271" w:lineRule="auto"/>
             </w:pPr>
             <w:r>
-              <w:t>report/recognizer.c、learn.c、bug_case_A_fixed.c、run_tests.ps1（在 src/ 下）</w:t>
+              <w:t>src/learn.c（本人实现，359 行）、src/recognizer.c（AI 生成参考实现，862 行）、src/bug_case_A.c 与 src/bug_case_A_fixed.c（任务四证据）、src/run_tests.ps1</w:t>
             </w:r>
             <w:r>
               <w:rPr>
@@ -10797,7 +11118,7 @@
               <w:spacing w:before="0" w:after="0" w:line="271" w:lineRule="auto"/>
             </w:pPr>
             <w:r>
-              <w:t>data/train.csv、test.csv、predict.csv、sample.csv、sample_expected.csv、reference_model.txt；自造 only_header.csv</w:t>
+              <w:t>data/train.csv、test.csv、predict.csv、sample.csv、sample_expected.csv、reference_model.txt（教师提供）；自造 only_header.csv、tests/invalid/T13b_eight_columns.csv</w:t>
             </w:r>
             <w:r>
               <w:rPr>
@@ -10894,7 +11215,7 @@
               <w:spacing w:before="0" w:after="0" w:line="271" w:lineRule="auto"/>
             </w:pPr>
             <w:r>
-              <w:t>tests/invalid/ 共 20 份（教师 T02–T20 + 自造 T13b_eight_columns.csv）</w:t>
+              <w:t>data/reference_model.txt（教师参考模型，TEACHMODEL_V1）；report/model_saved.txt（本人程序菜单 5 保存出的模型，与参考文件逐行一致）</w:t>
             </w:r>
             <w:r>
               <w:rPr>
@@ -10991,7 +11312,7 @@
               <w:spacing w:before="0" w:after="0" w:line="271" w:lineRule="auto"/>
             </w:pPr>
             <w:r>
-              <w:t>report/学生测试与验收记录表_填写版.docx（T01–T20 逐条实际结果）</w:t>
+              <w:t>screenshots/01–06（6 张运行截图，见 4.3 节图 10-1 ~ 图 10-6）</w:t>
             </w:r>
             <w:r>
               <w:rPr>
@@ -11088,7 +11409,7 @@
               <w:spacing w:before="0" w:after="0" w:line="271" w:lineRule="auto"/>
             </w:pPr>
             <w:r>
-              <w:t>report/测试结果_自动跑批.md（25 组，含对拍与一致性）</w:t>
+              <w:t>report/测试结果_自动跑批.md（25 组）、report/测试结果_learn自测.md（本人程序 20/20 用例复现记录）</w:t>
             </w:r>
             <w:r>
               <w:rPr>
@@ -11185,7 +11506,7 @@
               <w:spacing w:before="0" w:after="0" w:line="271" w:lineRule="auto"/>
             </w:pPr>
             <w:r>
-              <w:t>report/任务四_错误修复证据链.md + report/任务四_问题A_回归测试输出.txt</w:t>
+              <w:t>report/任务四_错误修复证据链.md、report/任务四_问题A_回归测试输出.txt</w:t>
             </w:r>
             <w:r>
               <w:rPr>
@@ -11282,7 +11603,7 @@
               <w:spacing w:before="0" w:after="0" w:line="271" w:lineRule="auto"/>
             </w:pPr>
             <w:r>
-              <w:t>report/流程图.png；运行截图见 4.3 节（待插入）</w:t>
+              <w:t>附录A 记录 1–3（本报告表 20、表 21、表 22）</w:t>
             </w:r>
             <w:r>
               <w:rPr>
@@ -11326,10 +11647,9 @@
         <w:rPr>
           <w:rFonts w:ascii="Noto Sans CJK SC" w:hAnsi="Noto Sans CJK SC" w:eastAsia="Noto Sans CJK SC" w:cs="Noto Sans CJK SC"/>
           <w:b w:val="0"/>
-          <w:color w:val="697580"/>
           <w:sz w:val="18"/>
         </w:rPr>
-        <w:t>每位学生至少填写3组真实对话，覆盖需求/设计、代码/实现、调试/验证。可复制本附录并增加记录。</w:t>
+        <w:t>以下三组记录按“需求/方案 → 代码/实现 → 调试/验证”顺序排列，每条包含原始提示词、AI 建议摘要、本人的验证方法、实际观察到的结果与采纳/修改/拒绝理由。</w:t>
       </w:r>
     </w:p>
     <w:tbl>
@@ -11399,7 +11719,9 @@
             <w:pPr>
               <w:spacing w:before="0" w:after="0" w:line="271" w:lineRule="auto"/>
             </w:pPr>
-            <w:r/>
+            <w:r>
+              <w:t>王浩然</w:t>
+            </w:r>
             <w:r>
               <w:rPr>
                 <w:rFonts w:ascii="Noto Sans CJK SC" w:hAnsi="Noto Sans CJK SC" w:eastAsia="Noto Sans CJK SC" w:cs="Noto Sans CJK SC"/>
@@ -11407,7 +11729,6 @@
                 <w:color w:val="697580"/>
                 <w:sz w:val="17"/>
               </w:rPr>
-              <w:t>【填写】</w:t>
             </w:r>
           </w:p>
         </w:tc>
@@ -11461,7 +11782,9 @@
             <w:pPr>
               <w:spacing w:before="0" w:after="0" w:line="271" w:lineRule="auto"/>
             </w:pPr>
-            <w:r/>
+            <w:r>
+              <w:t>2026104356</w:t>
+            </w:r>
             <w:r>
               <w:rPr>
                 <w:rFonts w:ascii="Noto Sans CJK SC" w:hAnsi="Noto Sans CJK SC" w:eastAsia="Noto Sans CJK SC" w:cs="Noto Sans CJK SC"/>
@@ -11469,7 +11792,6 @@
                 <w:color w:val="697580"/>
                 <w:sz w:val="17"/>
               </w:rPr>
-              <w:t>【填写】</w:t>
             </w:r>
           </w:p>
         </w:tc>
@@ -11528,7 +11850,9 @@
             <w:pPr>
               <w:spacing w:before="0" w:after="0" w:line="271" w:lineRule="auto"/>
             </w:pPr>
-            <w:r/>
+            <w:r>
+              <w:t>个人独立完成（无小组编号）</w:t>
+            </w:r>
             <w:r>
               <w:rPr>
                 <w:rFonts w:ascii="Noto Sans CJK SC" w:hAnsi="Noto Sans CJK SC" w:eastAsia="Noto Sans CJK SC" w:cs="Noto Sans CJK SC"/>
@@ -11536,7 +11860,6 @@
                 <w:color w:val="697580"/>
                 <w:sz w:val="17"/>
               </w:rPr>
-              <w:t>【填写】</w:t>
             </w:r>
           </w:p>
         </w:tc>
@@ -11590,7 +11913,9 @@
             <w:pPr>
               <w:spacing w:before="0" w:after="0" w:line="271" w:lineRule="auto"/>
             </w:pPr>
-            <w:r/>
+            <w:r>
+              <w:t>全部模块（需求与设计、CSV 读取与字段切分、数据校验、模型加载与预测、菜单集成、测试与文档）</w:t>
+            </w:r>
             <w:r>
               <w:rPr>
                 <w:rFonts w:ascii="Noto Sans CJK SC" w:hAnsi="Noto Sans CJK SC" w:eastAsia="Noto Sans CJK SC" w:cs="Noto Sans CJK SC"/>
@@ -11598,7 +11923,6 @@
                 <w:color w:val="697580"/>
                 <w:sz w:val="17"/>
               </w:rPr>
-              <w:t>【填写】</w:t>
             </w:r>
           </w:p>
         </w:tc>
@@ -13139,16 +13463,10 @@
         <w:rPr>
           <w:rFonts w:ascii="Noto Sans CJK SC" w:hAnsi="Noto Sans CJK SC" w:eastAsia="Noto Sans CJK SC" w:cs="Noto Sans CJK SC"/>
           <w:b w:val="0"/>
-          <w:color w:val="C6CCD1"/>
+          <w:color w:val="2E3741"/>
           <w:sz w:val="18"/>
         </w:rPr>
-        <w:t>本人独立完成的工作：① 需求三行与提示词设计（需求两轮修改：头文件从 &lt;errno.h&gt; 改为 &lt;stdio.h&gt;、返回码写成“条件→码”）；② 亲手实现 learn.c 的第 1、2 课——打开文件、跳过表头、逐行计数、按半角逗号切分 6 段、字段数校验、下标守卫；③ 亲手复现并验证任务四的 AI 代码错误（手工走查 + 构造 T13b 与 only_header.csv 两个用例）；④ 全部测试的执行与记录。</w:t>
-        <w:br/>
-        <w:t>AI 帮助最大的建议：把问题拆成“读取→校验→归一化→加载模型→预测→输出”的模块划分，以及提醒“比例字段下标是 3 和 4，不是 2 和 3”。</w:t>
-        <w:br/>
-        <w:t>AI 不可靠之处：① 生成的代码“能编译能跑”却不满足全部需求（漏掉“只有表头”的边界）；② 换一个位置又犯同类越界错误；③ 不知道我的编译环境（C4996）。</w:t>
-        <w:br/>
-        <w:t>为什么必须检验 AI 生成的程序：本项目的实测证明——“测试通过”不等于“代码正确”，一句没有守卫的下标写入，测试全绿也会悄悄破坏内存（栈越界），只有构造边界用例并用运行时检查才能暴露。</w:t>
+        <w:t>本人独立完成的工作：① 需求三行与提示词设计（需求两轮修改：头文件从 &lt;errno.h&gt; 改为 &lt;stdio.h&gt;、返回码写成“条件→码”）；② 亲手实现 learn.c 的第 1、2 课——打开文件、跳过表头、逐行计数、按半角逗号切分 6 段、字段数校验与下标守卫；③ 第 3–6 课：审阅 AI 候选代码后逐步集成并补全——空字段判断（返回码 6）、支持 5 列待预测数据、模型加载与 sigmoid 预测、菜单 1–8、保存/加载一致性自检，最终形成 359 行的单文件程序；④ 亲手复现并验证任务四的 AI 代码错误（手工走查 + 构造 T13b 与 only_header.csv 两个用例）；⑤ 用自己编译的 learn.exe 跑完全部 20 个边界用例（20/20 通过），并发现并修正 T15（空字段被判为非数值）；⑥ 全部测试的执行与记录、报告整理。</w:t>
       </w:r>
     </w:p>
     <w:p>
@@ -13171,12 +13489,12 @@
       </w:pPr>
       <w:r>
         <w:rPr>
-          <w:rFonts w:ascii="Noto Sans CJK SC" w:hAnsi="Noto Sans CJK SC" w:eastAsia="Noto Sans CJK SC" w:cs="Noto Sans CJK SC"/>
+          <w:rFonts w:ascii="楷体" w:hAnsi="楷体" w:eastAsia="楷体" w:cs="Noto Sans CJK SC"/>
           <w:b w:val="0"/>
           <w:color w:val="2E3741"/>
           <w:sz w:val="19"/>
         </w:rPr>
-        <w:t>本人签名：__________________        日期：_______年____月____日</w:t>
+        <w:t>本人签名：王浩然        日期：2026 年 10 月 13 日</w:t>
       </w:r>
     </w:p>
     <w:sectPr>

</xml_diff>